<commit_message>
feat(contenedor): agrega contenedor independiente del pipeline para Fargate (#97)
Separa el Dockerfile en los targets api y pipeline, que generan dos imágenes
independientes (saad-api y saad-pipeline). El punto de entrada del pipeline
(src/cloud/pipeline_task.py) sincroniza data/ y reports/ con S3, ejecuta la
actualización semanal forzando el pronóstico, sube solo los cambios, no
publica nada si un paso falla y fuerza un nuevo despliegue de la API. Agrega
la definición de la tarea de ECS con 50 GiB de disco efímero y una
verificación de espacio antes de descargar.

Co-Authored-By: Claude Opus 5.5 <noreply@anthropic.com>
</commit_message>
<xml_diff>
--- a/docs/08-arquitectura/Arquitectura_ToBe_AWS.docx
+++ b/docs/08-arquitectura/Arquitectura_ToBe_AWS.docx
@@ -5696,7 +5696,7 @@
               <w:rPr>
                 <w:sz w:val="18"/>
               </w:rPr>
-              <w:t>A favor: mismas imágenes que en el as-is, sin servidores, con HTTPS y con datos que se actualizan solos. En contra: ≈ US$57 al mes, la mayor parte fija por el balanceador; exige resolver R-01, R-09 y R-10 antes de desplegar.</w:t>
+              <w:t>A favor: mismas imágenes que en el as-is, sin servidores, con HTTPS y con datos que se actualizan solos. En contra: ≈ US$57 al mes, la mayor parte fija por el balanceador; exige resolver R-01 antes de desplegar.</w:t>
             </w:r>
           </w:p>
         </w:tc>
@@ -5974,7 +5974,7 @@
         <w:rPr>
           <w:sz w:val="21"/>
         </w:rPr>
-        <w:t xml:space="preserve"> deben resolverse R-01, R-09 y R-10 (sección 10).</w:t>
+        <w:t xml:space="preserve"> debe resolverse R-01 (sección 10); R-09 y R-10 ya están resueltos en la imagen del pipeline.</w:t>
       </w:r>
     </w:p>
     <w:p>
@@ -6150,7 +6150,7 @@
               <w:rPr>
                 <w:sz w:val="17"/>
               </w:rPr>
-              <w:t>Que la API consuma solo outputs procesados (~200 MB) antes de desplegar.</w:t>
+              <w:t>Que la API consuma solo outputs procesados (~200 MB) y los baje desde S3 al arrancar.</w:t>
             </w:r>
           </w:p>
         </w:tc>
@@ -6752,33 +6752,59 @@
               <w:rPr>
                 <w:sz w:val="17"/>
               </w:rPr>
-              <w:t xml:space="preserve">Sincronizar </w:t>
+              <w:t xml:space="preserve">Implementado: la imagen </w:t>
             </w:r>
             <w:r>
               <w:rPr>
                 <w:rFonts w:ascii="Consolas" w:hAnsi="Consolas"/>
                 <w:sz w:val="17"/>
               </w:rPr>
-              <w:t>data/</w:t>
+              <w:t>saad-pipeline</w:t>
             </w:r>
             <w:r>
               <w:rPr>
                 <w:sz w:val="17"/>
               </w:rPr>
-              <w:t xml:space="preserve"> y </w:t>
+              <w:t xml:space="preserve"> (</w:t>
             </w:r>
             <w:r>
               <w:rPr>
                 <w:rFonts w:ascii="Consolas" w:hAnsi="Consolas"/>
                 <w:sz w:val="17"/>
               </w:rPr>
+              <w:t>src/cloud/pipeline_task.py</w:t>
+            </w:r>
+            <w:r>
+              <w:rPr>
+                <w:sz w:val="17"/>
+              </w:rPr>
+              <w:t xml:space="preserve">) sincroniza </w:t>
+            </w:r>
+            <w:r>
+              <w:rPr>
+                <w:rFonts w:ascii="Consolas" w:hAnsi="Consolas"/>
+                <w:sz w:val="17"/>
+              </w:rPr>
+              <w:t>data/</w:t>
+            </w:r>
+            <w:r>
+              <w:rPr>
+                <w:sz w:val="17"/>
+              </w:rPr>
+              <w:t xml:space="preserve"> y </w:t>
+            </w:r>
+            <w:r>
+              <w:rPr>
+                <w:rFonts w:ascii="Consolas" w:hAnsi="Consolas"/>
+                <w:sz w:val="17"/>
+              </w:rPr>
               <w:t>reports/</w:t>
             </w:r>
             <w:r>
               <w:rPr>
                 <w:sz w:val="17"/>
               </w:rPr>
-              <w:t xml:space="preserve"> con S3 antes y después de la ejecución, sin cambiar el pipeline.</w:t>
+              <w:t xml:space="preserve"> con S3 antes y después, sin cambiar el pipeline; si un paso falla no sube nada.</w:t>
             </w:r>
           </w:p>
         </w:tc>
@@ -6852,7 +6878,7 @@
               <w:rPr>
                 <w:sz w:val="17"/>
               </w:rPr>
-              <w:t xml:space="preserve">Que la tarea termine forzando un nuevo despliegue del servicio </w:t>
+              <w:t xml:space="preserve">Implementado: al terminar con cambios, la tarea fuerza un nuevo despliegue del servicio </w:t>
             </w:r>
             <w:r>
               <w:rPr>
@@ -6865,7 +6891,33 @@
               <w:rPr>
                 <w:sz w:val="17"/>
               </w:rPr>
-              <w:t>.</w:t>
+              <w:t xml:space="preserve"> (variables </w:t>
+            </w:r>
+            <w:r>
+              <w:rPr>
+                <w:rFonts w:ascii="Consolas" w:hAnsi="Consolas"/>
+                <w:sz w:val="17"/>
+              </w:rPr>
+              <w:t>SAAD_ECS_CLUSTER</w:t>
+            </w:r>
+            <w:r>
+              <w:rPr>
+                <w:sz w:val="17"/>
+              </w:rPr>
+              <w:t xml:space="preserve"> y </w:t>
+            </w:r>
+            <w:r>
+              <w:rPr>
+                <w:rFonts w:ascii="Consolas" w:hAnsi="Consolas"/>
+                <w:sz w:val="17"/>
+              </w:rPr>
+              <w:t>SAAD_ECS_SERVICE</w:t>
+            </w:r>
+            <w:r>
+              <w:rPr>
+                <w:sz w:val="17"/>
+              </w:rPr>
+              <w:t>).</w:t>
             </w:r>
           </w:p>
         </w:tc>

</xml_diff>

<commit_message>
docs(contenedor): actualiza diagrama de contenedores con la imagen saad-pipeline (#97)
El diagrama indicaba que el pipeline usaba la imagen de la API. Ahora muestra
las dos imágenes independientes (saad-api y saad-pipeline) y los dos targets
del Dockerfile. Ajusta en el documento to-be las menciones a la imagen y el
costo del registro de imágenes, que pasa a guardar dos imágenes (total base
estimado en ≈ US$56,71 al mes).

Co-Authored-By: Claude Sonnet 5.5 <noreply@anthropic.com>
</commit_message>
<xml_diff>
--- a/docs/08-arquitectura/Arquitectura_ToBe_AWS.docx
+++ b/docs/08-arquitectura/Arquitectura_ToBe_AWS.docx
@@ -2057,20 +2057,20 @@
               <w:rPr>
                 <w:sz w:val="17"/>
               </w:rPr>
-              <w:t xml:space="preserve">Tarea programada con la misma imagen </w:t>
+              <w:t xml:space="preserve">Tarea programada con la imagen </w:t>
             </w:r>
             <w:r>
               <w:rPr>
                 <w:rFonts w:ascii="Consolas" w:hAnsi="Consolas"/>
                 <w:sz w:val="17"/>
               </w:rPr>
-              <w:t>saad-api</w:t>
+              <w:t>saad-pipeline</w:t>
             </w:r>
             <w:r>
               <w:rPr>
                 <w:sz w:val="17"/>
               </w:rPr>
-              <w:t xml:space="preserve"> (4 vCPU, 16 GB).</w:t>
+              <w:t>, independiente de la API (4 vCPU, 16 GB, 50 GiB de disco).</w:t>
             </w:r>
           </w:p>
         </w:tc>
@@ -3337,7 +3337,7 @@
               <w:rPr>
                 <w:sz w:val="17"/>
               </w:rPr>
-              <w:t>Ídem; 0,000111 por GB·h efímero sobre 20 GB</w:t>
+              <w:t>Ídem; 0,000111 por GiB·h sobre los 30 GiB que exceden los 20 gratuitos</w:t>
             </w:r>
           </w:p>
         </w:tc>
@@ -3354,7 +3354,7 @@
               <w:rPr>
                 <w:sz w:val="17"/>
               </w:rPr>
-              <w:t>1,02</w:t>
+              <w:t>1,03</w:t>
             </w:r>
           </w:p>
         </w:tc>
@@ -3680,7 +3680,7 @@
               <w:rPr>
                 <w:sz w:val="17"/>
               </w:rPr>
-              <w:t>~2 GB (dos versiones de una imagen de 840 MB)</w:t>
+              <w:t>~3,5 GB (imágenes saad-api y saad-pipeline, ~865 MB cada una, dos versiones de cada una)</w:t>
             </w:r>
           </w:p>
         </w:tc>
@@ -3712,7 +3712,7 @@
               <w:rPr>
                 <w:sz w:val="17"/>
               </w:rPr>
-              <w:t>0,20</w:t>
+              <w:t>0,35</w:t>
             </w:r>
           </w:p>
         </w:tc>
@@ -3989,7 +3989,7 @@
                 <w:b/>
                 <w:sz w:val="17"/>
               </w:rPr>
-              <w:t>≈ 56,55</w:t>
+              <w:t>≈ 56,71</w:t>
             </w:r>
           </w:p>
         </w:tc>
@@ -4154,7 +4154,7 @@
           <w:b/>
           <w:sz w:val="21"/>
         </w:rPr>
-        <w:t>Base: ≈ US$57 al mes (≈ US$679 al año).</w:t>
+        <w:t>Base: ≈ US$57 al mes (≈ US$680 al año).</w:t>
       </w:r>
       <w:r>
         <w:rPr>
@@ -4950,7 +4950,33 @@
               <w:rPr>
                 <w:sz w:val="17"/>
               </w:rPr>
-              <w:t>La misma imagen corre en el equipo y en Fargate; elimina diferencias de entorno.</w:t>
+              <w:t>Dos imágenes independientes (</w:t>
+            </w:r>
+            <w:r>
+              <w:rPr>
+                <w:rFonts w:ascii="Consolas" w:hAnsi="Consolas"/>
+                <w:sz w:val="17"/>
+              </w:rPr>
+              <w:t>saad-api</w:t>
+            </w:r>
+            <w:r>
+              <w:rPr>
+                <w:sz w:val="17"/>
+              </w:rPr>
+              <w:t xml:space="preserve"> y </w:t>
+            </w:r>
+            <w:r>
+              <w:rPr>
+                <w:rFonts w:ascii="Consolas" w:hAnsi="Consolas"/>
+                <w:sz w:val="17"/>
+              </w:rPr>
+              <w:t>saad-pipeline</w:t>
+            </w:r>
+            <w:r>
+              <w:rPr>
+                <w:sz w:val="17"/>
+              </w:rPr>
+              <w:t>) que corren igual en el equipo y en Fargate.</w:t>
             </w:r>
           </w:p>
         </w:tc>

</xml_diff>

<commit_message>
docs(presupuesto): agrega verificación de costos AWS y evidencia del Pricing Calculator (#96)
Verifica precios unitarios contra la AWS Pricing API, concilia el total del
calculador (US$107,62) con el total base del documento (US$56,71) y enlaza la
estimación como evidencia en la sección 4 de la arquitectura to-be.

Co-Authored-By: Claude Sonnet 5.5 <noreply@anthropic.com>
</commit_message>
<xml_diff>
--- a/docs/08-arquitectura/Arquitectura_ToBe_AWS.docx
+++ b/docs/08-arquitectura/Arquitectura_ToBe_AWS.docx
@@ -3112,7 +3112,33 @@
         <w:rPr>
           <w:sz w:val="21"/>
         </w:rPr>
-        <w:t>: deben confirmarse ingresando estas mismas configuraciones en AWS Pricing Calculator y adjuntando el enlace como evidencia.</w:t>
+        <w:t xml:space="preserve">. Se contrastaron con AWS Pricing Calculator (exportación en </w:t>
+      </w:r>
+      <w:r>
+        <w:rPr>
+          <w:rFonts w:ascii="Consolas" w:hAnsi="Consolas"/>
+          <w:sz w:val="20"/>
+        </w:rPr>
+        <w:t>docs/08-arquitectura/estimacion-costos-aws.pdf</w:t>
+      </w:r>
+      <w:r>
+        <w:rPr>
+          <w:sz w:val="21"/>
+        </w:rPr>
+        <w:t xml:space="preserve">; enlace: https://calculator.aws/#/estimate?id=1da7b171122c6261d3c64797db55485928d23129): las tareas Fargate de la API, el balanceador, S3 y ECR coinciden; las diferencias del total del calculador (US$107,62) se deben a Aurora, a la capa gratuita de CloudFront que el calculador no aplica y a servicios fuera del diseño, y están conciliadas en </w:t>
+      </w:r>
+      <w:r>
+        <w:rPr>
+          <w:rFonts w:ascii="Consolas" w:hAnsi="Consolas"/>
+          <w:sz w:val="20"/>
+        </w:rPr>
+        <w:t>costos_aws_verificacion.md</w:t>
+      </w:r>
+      <w:r>
+        <w:rPr>
+          <w:sz w:val="21"/>
+        </w:rPr>
+        <w:t>.</w:t>
       </w:r>
     </w:p>
     <w:tbl>

</xml_diff>